<commit_message>
v1.2.0: analyses added after an external assessment round (no model retrained)
</commit_message>
<xml_diff>
--- a/Results/Supplementary/Ek_H3_ham_oranlar.docx
+++ b/Results/Supplementary/Ek_H3_ham_oranlar.docx
@@ -25,7 +25,7 @@
           <w:szCs w:val="20"/>
           <w:color w:val="000000"/>
         </w:rPr>
-        <w:t xml:space="preserve">Table S–. Analytic samples of the dietary and health-cost comparisons: numbers, events and crude weighted prevalences by group, 2025.</w:t>
+        <w:t xml:space="preserve">Table S–. Analytic samples of the consumption-frequency and health-cost comparisons: numbers, events and crude weighted prevalences by group, 2025.</w:t>
       </w:r>
     </w:p>
     <w:tbl xmlns:a="http://schemas.openxmlformats.org/drawingml/2006/main" xmlns:pic="http://schemas.openxmlformats.org/drawingml/2006/picture">
@@ -35,7 +35,7 @@
         <w:tblLook w:firstRow="1" w:lastRow="0" w:firstColumn="0" w:lastColumn="0" w:noHBand="0" w:noVBand="1"/>
       </w:tblPr>
       <w:tblGrid>
-        <w:gridCol w:w="3790"/>
+        <w:gridCol w:w="4120"/>
         <w:gridCol w:w="956"/>
         <w:gridCol w:w="1003"/>
         <w:gridCol w:w="3096"/>
@@ -546,7 +546,7 @@
                 <w:szCs w:val="18"/>
                 <w:color w:val="000000"/>
               </w:rPr>
-              <w:t xml:space="preserve">G1 food secure, all</w:t>
+              <w:t xml:space="preserve">G1 not meal-deprived, all</w:t>
             </w:r>
           </w:p>
         </w:tc>
@@ -771,7 +771,7 @@
                 <w:szCs w:val="18"/>
                 <w:color w:val="000000"/>
               </w:rPr>
-              <w:t xml:space="preserve">G1 food secure, not poor (reference in C1)</w:t>
+              <w:t xml:space="preserve">G1 not meal-deprived, not poor (reference in C1)</w:t>
             </w:r>
           </w:p>
         </w:tc>
@@ -996,7 +996,7 @@
                 <w:szCs w:val="18"/>
                 <w:color w:val="000000"/>
               </w:rPr>
-              <w:t xml:space="preserve">G2 food insecure, not poor</w:t>
+              <w:t xml:space="preserve">G2 meal-deprived, not poor</w:t>
             </w:r>
           </w:p>
         </w:tc>
@@ -1221,7 +1221,7 @@
                 <w:szCs w:val="18"/>
                 <w:color w:val="000000"/>
               </w:rPr>
-              <w:t xml:space="preserve">G3 food insecure and poor (reference in C2)</w:t>
+              <w:t xml:space="preserve">G3 meal-deprived and poor (reference in C2)</w:t>
             </w:r>
           </w:p>
         </w:tc>
@@ -1671,7 +1671,7 @@
                 <w:szCs w:val="18"/>
                 <w:color w:val="000000"/>
               </w:rPr>
-              <w:t xml:space="preserve">G1 food secure, all</w:t>
+              <w:t xml:space="preserve">G1 not meal-deprived, all</w:t>
             </w:r>
           </w:p>
         </w:tc>
@@ -1896,7 +1896,7 @@
                 <w:szCs w:val="18"/>
                 <w:color w:val="000000"/>
               </w:rPr>
-              <w:t xml:space="preserve">G1 food secure, not poor (reference in C1)</w:t>
+              <w:t xml:space="preserve">G1 not meal-deprived, not poor (reference in C1)</w:t>
             </w:r>
           </w:p>
         </w:tc>
@@ -2121,7 +2121,7 @@
                 <w:szCs w:val="18"/>
                 <w:color w:val="000000"/>
               </w:rPr>
-              <w:t xml:space="preserve">G2 food insecure, not poor</w:t>
+              <w:t xml:space="preserve">G2 meal-deprived, not poor</w:t>
             </w:r>
           </w:p>
         </w:tc>
@@ -2346,7 +2346,7 @@
                 <w:szCs w:val="18"/>
                 <w:color w:val="000000"/>
               </w:rPr>
-              <w:t xml:space="preserve">G3 food insecure and poor (reference in C2)</w:t>
+              <w:t xml:space="preserve">G3 meal-deprived and poor (reference in C2)</w:t>
             </w:r>
           </w:p>
         </w:tc>
@@ -2796,7 +2796,7 @@
                 <w:szCs w:val="18"/>
                 <w:color w:val="000000"/>
               </w:rPr>
-              <w:t xml:space="preserve">G1 food secure, all</w:t>
+              <w:t xml:space="preserve">G1 not meal-deprived, all</w:t>
             </w:r>
           </w:p>
         </w:tc>
@@ -3021,7 +3021,7 @@
                 <w:szCs w:val="18"/>
                 <w:color w:val="000000"/>
               </w:rPr>
-              <w:t xml:space="preserve">G1 food secure, not poor (reference in C1)</w:t>
+              <w:t xml:space="preserve">G1 not meal-deprived, not poor (reference in C1)</w:t>
             </w:r>
           </w:p>
         </w:tc>
@@ -3246,7 +3246,7 @@
                 <w:szCs w:val="18"/>
                 <w:color w:val="000000"/>
               </w:rPr>
-              <w:t xml:space="preserve">G2 food insecure, not poor</w:t>
+              <w:t xml:space="preserve">G2 meal-deprived, not poor</w:t>
             </w:r>
           </w:p>
         </w:tc>
@@ -3471,7 +3471,7 @@
                 <w:szCs w:val="18"/>
                 <w:color w:val="000000"/>
               </w:rPr>
-              <w:t xml:space="preserve">G3 food insecure and poor (reference in C2)</w:t>
+              <w:t xml:space="preserve">G3 meal-deprived and poor (reference in C2)</w:t>
             </w:r>
           </w:p>
         </w:tc>
@@ -3921,7 +3921,7 @@
                 <w:szCs w:val="18"/>
                 <w:color w:val="000000"/>
               </w:rPr>
-              <w:t xml:space="preserve">G1 food secure, all</w:t>
+              <w:t xml:space="preserve">G1 not meal-deprived, all</w:t>
             </w:r>
           </w:p>
         </w:tc>
@@ -4146,7 +4146,7 @@
                 <w:szCs w:val="18"/>
                 <w:color w:val="000000"/>
               </w:rPr>
-              <w:t xml:space="preserve">G1 food secure, not poor (reference in C1)</w:t>
+              <w:t xml:space="preserve">G1 not meal-deprived, not poor (reference in C1)</w:t>
             </w:r>
           </w:p>
         </w:tc>
@@ -4371,7 +4371,7 @@
                 <w:szCs w:val="18"/>
                 <w:color w:val="000000"/>
               </w:rPr>
-              <w:t xml:space="preserve">G2 food insecure, not poor</w:t>
+              <w:t xml:space="preserve">G2 meal-deprived, not poor</w:t>
             </w:r>
           </w:p>
         </w:tc>
@@ -4596,7 +4596,7 @@
                 <w:szCs w:val="18"/>
                 <w:color w:val="000000"/>
               </w:rPr>
-              <w:t xml:space="preserve">G3 food insecure and poor (reference in C2)</w:t>
+              <w:t xml:space="preserve">G3 meal-deprived and poor (reference in C2)</w:t>
             </w:r>
           </w:p>
         </w:tc>
@@ -4883,7 +4883,7 @@
                 <w:szCs w:val="16"/>
                 <w:color w:val="000000"/>
               </w:rPr>
-              <w:t xml:space="preserve">C1 compares G2 with food-secure adults who are not poor, so its reference is not all of G1. Crude differences and prevalence ratios are the first row of each block in Supplementary Table S16.</w:t>
+              <w:t xml:space="preserve">C1 compares G2 with adults who are neither meal-deprived nor poor, so its reference is not all of G1. Crude differences and prevalence ratios are the first row of each block in Supplementary Table S16.</w:t>
             </w:r>
           </w:p>
         </w:tc>

</xml_diff>